<commit_message>
Correct doc 29: fillers are not the robotic fix
Section 3 was written believing the backchannel clips fixed "it sounds robotic".
They do not, and they stay off -- they were shipped to this client twice and he
heard them both times (runs 267 and 273). The section now leads with that, and
the status table no longer claims robotic is fixed.

Co-Authored-By: Claude Opus 5 (1M context) <noreply@anthropic.com>
</commit_message>
<xml_diff>
--- a/docs/voice-platform/29-the-four-bugs-and-the-turn-detector-truth-2026-09-06.docx
+++ b/docs/voice-platform/29-the-four-bugs-and-the-turn-detector-truth-2026-09-06.docx
@@ -1197,7 +1197,158 @@
           <w:rFonts w:ascii="Nirmala UI" w:hAnsi="Nirmala UI" w:eastAsia="Nirmala UI" w:cs="Nirmala UI"/>
           <w:color w:val="1F4E79"/>
         </w:rPr>
-        <w:t>3. Why it sounded robotic — and it was never the prompt</w:t>
+        <w:t>3. Robotic — a correction, and why fillers are NOT the answer</w:t>
+      </w:r>
+    </w:p>
+    <w:p>
+      <w:pPr>
+        <w:spacing w:before="120" w:after="120"/>
+        <w:ind w:left="432"/>
+      </w:pPr>
+      <w:r>
+        <w:rPr>
+          <w:rFonts w:ascii="Nirmala UI" w:hAnsi="Nirmala UI" w:eastAsia="Nirmala UI" w:cs="Nirmala UI"/>
+          <w:b/>
+          <w:i/>
+          <w:color w:val="5A5A5A"/>
+        </w:rPr>
+        <w:t>CORRECTED later the same day.</w:t>
+      </w:r>
+      <w:r>
+        <w:rPr>
+          <w:rFonts w:ascii="Nirmala UI" w:hAnsi="Nirmala UI" w:eastAsia="Nirmala UI" w:cs="Nirmala UI"/>
+          <w:i/>
+          <w:color w:val="5A5A5A"/>
+        </w:rPr>
+        <w:t xml:space="preserve"> The section below was written believing the backchannel fillers were the fix. They are not, and they have been left OFF.  </w:t>
+      </w:r>
+      <w:r>
+        <w:rPr>
+          <w:rFonts w:ascii="Consolas" w:hAnsi="Consolas" w:eastAsia="Consolas" w:cs="Consolas"/>
+          <w:i/>
+          <w:color w:val="5A5A5A"/>
+          <w:sz w:val="18"/>
+        </w:rPr>
+        <w:t>DEFAULT_FILLERS_ENABLED = False</w:t>
+      </w:r>
+      <w:r>
+        <w:rPr>
+          <w:rFonts w:ascii="Nirmala UI" w:hAnsi="Nirmala UI" w:eastAsia="Nirmala UI" w:cs="Nirmala UI"/>
+          <w:i/>
+          <w:color w:val="5A5A5A"/>
+        </w:rPr>
+        <w:t xml:space="preserve"> is deliberate, and the comment above it records why: fillers were shipped to this client </w:t>
+      </w:r>
+      <w:r>
+        <w:rPr>
+          <w:rFonts w:ascii="Nirmala UI" w:hAnsi="Nirmala UI" w:eastAsia="Nirmala UI" w:cs="Nirmala UI"/>
+          <w:b/>
+          <w:i/>
+          <w:color w:val="5A5A5A"/>
+        </w:rPr>
+        <w:t>twice</w:t>
+      </w:r>
+      <w:r>
+        <w:rPr>
+          <w:rFonts w:ascii="Nirmala UI" w:hAnsi="Nirmala UI" w:eastAsia="Nirmala UI" w:cs="Nirmala UI"/>
+          <w:i/>
+          <w:color w:val="5A5A5A"/>
+        </w:rPr>
+        <w:t xml:space="preserve"> and he heard them both times.  </w:t>
+      </w:r>
+      <w:r>
+        <w:rPr>
+          <w:rFonts w:ascii="Nirmala UI" w:hAnsi="Nirmala UI" w:eastAsia="Nirmala UI" w:cs="Nirmala UI"/>
+          <w:i/>
+          <w:color w:val="5A5A5A"/>
+        </w:rPr>
+        <w:t xml:space="preserve"> run 267 (v1) — a clip at the VAD stop, then 1.0–1.8 s of silence anyway: </w:t>
+      </w:r>
+      <w:r>
+        <w:rPr>
+          <w:rFonts w:ascii="Nirmala UI" w:hAnsi="Nirmala UI" w:eastAsia="Nirmala UI" w:cs="Nirmala UI"/>
+          <w:i/>
+          <w:color w:val="5A5A5A"/>
+        </w:rPr>
+        <w:t>"that aaa in the middle ... it is like scripted"</w:t>
+      </w:r>
+      <w:r>
+        <w:rPr>
+          <w:rFonts w:ascii="Nirmala UI" w:hAnsi="Nirmala UI" w:eastAsia="Nirmala UI" w:cs="Nirmala UI"/>
+          <w:i/>
+          <w:color w:val="5A5A5A"/>
+        </w:rPr>
+        <w:t xml:space="preserve"> </w:t>
+      </w:r>
+      <w:r>
+        <w:rPr>
+          <w:rFonts w:ascii="Nirmala UI" w:hAnsi="Nirmala UI" w:eastAsia="Nirmala UI" w:cs="Nirmala UI"/>
+          <w:i/>
+          <w:color w:val="5A5A5A"/>
+        </w:rPr>
+        <w:t xml:space="preserve"> run 273 (v2) — a continuous paced cover. The caller heard the word as a stray interjection and asked what it was: </w:t>
+      </w:r>
+      <w:r>
+        <w:rPr>
+          <w:rFonts w:ascii="Nirmala UI" w:hAnsi="Nirmala UI" w:eastAsia="Nirmala UI" w:cs="Nirmala UI"/>
+          <w:i/>
+          <w:color w:val="5A5A5A"/>
+        </w:rPr>
+        <w:t>"ఆ ఏంది మంచిది ఏంది అది?"</w:t>
+      </w:r>
+      <w:r>
+        <w:rPr>
+          <w:rFonts w:ascii="Nirmala UI" w:hAnsi="Nirmala UI" w:eastAsia="Nirmala UI" w:cs="Nirmala UI"/>
+          <w:i/>
+          <w:color w:val="5A5A5A"/>
+        </w:rPr>
+        <w:t xml:space="preserve"> — what is this "మంచిది"?  The defect is upstream of timing: </w:t>
+      </w:r>
+      <w:r>
+        <w:rPr>
+          <w:rFonts w:ascii="Nirmala UI" w:hAnsi="Nirmala UI" w:eastAsia="Nirmala UI" w:cs="Nirmala UI"/>
+          <w:b/>
+          <w:i/>
+          <w:color w:val="5A5A5A"/>
+        </w:rPr>
+        <w:t>a pre-recorded word does not sound like the sentence it precedes.</w:t>
+      </w:r>
+      <w:r>
+        <w:rPr>
+          <w:rFonts w:ascii="Nirmala UI" w:hAnsi="Nirmala UI" w:eastAsia="Nirmala UI" w:cs="Nirmala UI"/>
+          <w:i/>
+          <w:color w:val="5A5A5A"/>
+        </w:rPr>
+        <w:t xml:space="preserve"> Different prosody, leads nowhere, and the caller notices. It is also directly against this project's standing requirement that replies be fully dynamic; pre-recorded speech has already been rejected here.  So the two bugs below are real and worth fixing — the renderer could not reach the live voice, and stale clips could outrank correct ones — but fixing them </w:t>
+      </w:r>
+      <w:r>
+        <w:rPr>
+          <w:rFonts w:ascii="Nirmala UI" w:hAnsi="Nirmala UI" w:eastAsia="Nirmala UI" w:cs="Nirmala UI"/>
+          <w:b/>
+          <w:i/>
+          <w:color w:val="5A5A5A"/>
+        </w:rPr>
+        <w:t>does not fix "robotic", and the feature stays off.</w:t>
+      </w:r>
+      <w:r>
+        <w:rPr>
+          <w:rFonts w:ascii="Nirmala UI" w:hAnsi="Nirmala UI" w:eastAsia="Nirmala UI" w:cs="Nirmala UI"/>
+          <w:i/>
+          <w:color w:val="5A5A5A"/>
+        </w:rPr>
+        <w:t xml:space="preserve"> What remains for robotic is the gap itself (latency, §5) and reply wording, both of which are generated rather than spliced.</w:t>
+      </w:r>
+    </w:p>
+    <w:p>
+      <w:pPr>
+        <w:pStyle w:val="Heading2"/>
+      </w:pPr>
+      <w:r>
+        <w:rPr>
+          <w:rFonts w:ascii="Nirmala UI" w:hAnsi="Nirmala UI" w:eastAsia="Nirmala UI" w:cs="Nirmala UI"/>
+          <w:color w:val="1F4E79"/>
+        </w:rPr>
+        <w:t>The two bugs found while investigating (fixed; feature still off)</w:t>
       </w:r>
     </w:p>
     <w:p>
@@ -3330,14 +3481,14 @@
                 <w:b/>
                 <w:sz w:val="18"/>
               </w:rPr>
-              <w:t>fixed</w:t>
+              <w:t>NOT fixed</w:t>
             </w:r>
             <w:r>
               <w:rPr>
                 <w:rFonts w:ascii="Nirmala UI" w:hAnsi="Nirmala UI" w:eastAsia="Nirmala UI" w:cs="Nirmala UI"/>
                 <w:sz w:val="18"/>
               </w:rPr>
-              <w:t xml:space="preserve"> — six clips now render in the live voice</w:t>
+              <w:t xml:space="preserve"> — fillers were the wrong answer and stay off; see the correction in §3</w:t>
             </w:r>
           </w:p>
         </w:tc>

</xml_diff>